<commit_message>
Updated 21 6 2026
</commit_message>
<xml_diff>
--- a/templates/sk_jf.docx
+++ b/templates/sk_jf.docx
@@ -2,6 +2,76 @@
 <file path=word/document.xml><?xml version="1.0" encoding="utf-8"?>
 <w:document xmlns:wpc="http://schemas.microsoft.com/office/word/2010/wordprocessingCanvas" xmlns:cx="http://schemas.microsoft.com/office/drawing/2014/chartex" xmlns:cx1="http://schemas.microsoft.com/office/drawing/2015/9/8/chartex" xmlns:cx2="http://schemas.microsoft.com/office/drawing/2015/10/21/chartex" xmlns:cx3="http://schemas.microsoft.com/office/drawing/2016/5/9/chartex" xmlns:cx4="http://schemas.microsoft.com/office/drawing/2016/5/10/chartex" xmlns:cx5="http://schemas.microsoft.com/office/drawing/2016/5/11/chartex" xmlns:cx6="http://schemas.microsoft.com/office/drawing/2016/5/12/chartex" xmlns:cx7="http://schemas.microsoft.com/office/drawing/2016/5/13/chartex" xmlns:cx8="http://schemas.microsoft.com/office/drawing/2016/5/14/chartex" xmlns:mc="http://schemas.openxmlformats.org/markup-compatibility/2006" xmlns:aink="http://schemas.microsoft.com/office/drawing/2016/ink" xmlns:am3d="http://schemas.microsoft.com/office/drawing/2017/model3d" xmlns:o="urn:schemas-microsoft-com:office:office" xmlns:oel="http://schemas.microsoft.com/office/2019/extlst" xmlns:r="http://schemas.openxmlformats.org/officeDocument/2006/relationships" xmlns:m="http://schemas.openxmlformats.org/officeDocument/2006/math" xmlns:v="urn:schemas-microsoft-com:vml" xmlns:wp14="http://schemas.microsoft.com/office/word/2010/wordprocessingDrawing" xmlns:wp="http://schemas.openxmlformats.org/drawingml/2006/wordprocessingDrawing" xmlns:w10="urn:schemas-microsoft-com:office:word" xmlns:w="http://schemas.openxmlformats.org/wordprocessingml/2006/main" xmlns:w14="http://schemas.microsoft.com/office/word/2010/wordml" xmlns:w15="http://schemas.microsoft.com/office/word/2012/wordml" xmlns:w16cex="http://schemas.microsoft.com/office/word/2018/wordml/cex" xmlns:w16cid="http://schemas.microsoft.com/office/word/2016/wordml/cid" xmlns:w16="http://schemas.microsoft.com/office/word/2018/wordml" xmlns:w16du="http://schemas.microsoft.com/office/word/2023/wordml/word16du" xmlns:w16sdtdh="http://schemas.microsoft.com/office/word/2020/wordml/sdtdatahash" xmlns:w16sdtfl="http://schemas.microsoft.com/office/word/2024/wordml/sdtformatlock" xmlns:w16se="http://schemas.microsoft.com/office/word/2015/wordml/symex" xmlns:wpg="http://schemas.microsoft.com/office/word/2010/wordprocessingGroup" xmlns:wpi="http://schemas.microsoft.com/office/word/2010/wordprocessingInk" xmlns:wne="http://schemas.microsoft.com/office/word/2006/wordml" xmlns:wps="http://schemas.microsoft.com/office/word/2010/wordprocessingShape" mc:Ignorable="w14 w15 w16se w16cid w16 w16cex w16sdtdh w16sdtfl w16du wp14">
   <w:body>
+    <w:p>
+      <w:pPr>
+        <w:pStyle w:val="Header"/>
+        <w:jc w:val="center"/>
+      </w:pPr>
+      <w:r>
+        <w:rPr>
+          <w:rFonts w:ascii="Bookman Old Style" w:hAnsi="Bookman Old Style" w:cs="Arial"/>
+          <w:noProof/>
+        </w:rPr>
+        <w:drawing>
+          <wp:inline distT="0" distB="0" distL="0" distR="0" wp14:anchorId="3B7A3B0E" wp14:editId="5B3853C3">
+            <wp:extent cx="846000" cy="900000"/>
+            <wp:effectExtent l="0" t="0" r="0" b="0"/>
+            <wp:docPr id="296857715" name="Picture 296857715"/>
+            <wp:cNvGraphicFramePr>
+              <a:graphicFrameLocks xmlns:a="http://schemas.openxmlformats.org/drawingml/2006/main"/>
+            </wp:cNvGraphicFramePr>
+            <a:graphic xmlns:a="http://schemas.openxmlformats.org/drawingml/2006/main">
+              <a:graphicData uri="http://schemas.openxmlformats.org/drawingml/2006/picture">
+                <pic:pic xmlns:pic="http://schemas.openxmlformats.org/drawingml/2006/picture">
+                  <pic:nvPicPr>
+                    <pic:cNvPr id="1" name="kindpng_962264.png"/>
+                    <pic:cNvPicPr/>
+                  </pic:nvPicPr>
+                  <pic:blipFill>
+                    <a:blip r:embed="rId8" cstate="print">
+                      <a:extLst>
+                        <a:ext uri="{28A0092B-C50C-407E-A947-70E740481C1C}">
+                          <a14:useLocalDpi xmlns:a14="http://schemas.microsoft.com/office/drawing/2010/main" val="0"/>
+                        </a:ext>
+                      </a:extLst>
+                    </a:blip>
+                    <a:stretch>
+                      <a:fillRect/>
+                    </a:stretch>
+                  </pic:blipFill>
+                  <pic:spPr>
+                    <a:xfrm>
+                      <a:off x="0" y="0"/>
+                      <a:ext cx="846000" cy="900000"/>
+                    </a:xfrm>
+                    <a:prstGeom prst="rect">
+                      <a:avLst/>
+                    </a:prstGeom>
+                  </pic:spPr>
+                </pic:pic>
+              </a:graphicData>
+            </a:graphic>
+          </wp:inline>
+        </w:drawing>
+      </w:r>
+    </w:p>
+    <w:p>
+      <w:pPr>
+        <w:pStyle w:val="Header"/>
+        <w:jc w:val="center"/>
+        <w:rPr>
+          <w:sz w:val="28"/>
+          <w:szCs w:val="28"/>
+        </w:rPr>
+      </w:pPr>
+      <w:r>
+        <w:rPr>
+          <w:sz w:val="28"/>
+          <w:szCs w:val="28"/>
+        </w:rPr>
+        <w:t>BUPATI BANGKA</w:t>
+      </w:r>
+    </w:p>
     <w:p>
       <w:pPr>
         <w:jc w:val="center"/>
@@ -1602,6 +1672,7 @@
       <w:tblPr>
         <w:tblStyle w:val="TableGrid"/>
         <w:tblW w:w="0" w:type="auto"/>
+        <w:tblInd w:w="-5" w:type="dxa"/>
         <w:tblBorders>
           <w:top w:val="none" w:sz="0" w:space="0" w:color="auto"/>
           <w:left w:val="none" w:sz="0" w:space="0" w:color="auto"/>
@@ -1613,19 +1684,20 @@
         <w:tblLook w:val="04A0" w:firstRow="1" w:lastRow="0" w:firstColumn="1" w:lastColumn="0" w:noHBand="0" w:noVBand="1"/>
       </w:tblPr>
       <w:tblGrid>
-        <w:gridCol w:w="4585"/>
+        <w:gridCol w:w="4443"/>
         <w:gridCol w:w="4434"/>
       </w:tblGrid>
       <w:tr>
         <w:tc>
           <w:tcPr>
-            <w:tcW w:w="4585" w:type="dxa"/>
+            <w:tcW w:w="4443" w:type="dxa"/>
           </w:tcPr>
           <w:p>
             <w:pPr>
               <w:tabs>
                 <w:tab w:val="left" w:pos="3765"/>
               </w:tabs>
+              <w:ind w:left="-108"/>
               <w:rPr>
                 <w:rFonts w:cs="Times New Roman"/>
                 <w:sz w:val="22"/>
@@ -1648,6 +1720,7 @@
               <w:tabs>
                 <w:tab w:val="left" w:pos="3765"/>
               </w:tabs>
+              <w:ind w:left="-108"/>
               <w:rPr>
                 <w:rFonts w:cs="Times New Roman"/>
                 <w:sz w:val="22"/>
@@ -1679,6 +1752,7 @@
               <w:tabs>
                 <w:tab w:val="left" w:pos="3765"/>
               </w:tabs>
+              <w:ind w:left="-108"/>
               <w:rPr>
                 <w:rFonts w:cs="Times New Roman"/>
                 <w:sz w:val="22"/>
@@ -1701,6 +1775,7 @@
               <w:tabs>
                 <w:tab w:val="left" w:pos="3765"/>
               </w:tabs>
+              <w:ind w:left="-108"/>
               <w:rPr>
                 <w:rFonts w:cs="Times New Roman"/>
                 <w:sz w:val="22"/>
@@ -1723,6 +1798,7 @@
               <w:tabs>
                 <w:tab w:val="left" w:pos="3765"/>
               </w:tabs>
+              <w:ind w:left="-108"/>
               <w:rPr>
                 <w:rFonts w:cs="Times New Roman"/>
                 <w:sz w:val="22"/>
@@ -1935,9 +2011,8 @@
       </w:pPr>
     </w:p>
     <w:sectPr>
-      <w:headerReference w:type="default" r:id="rId8"/>
       <w:pgSz w:w="11909" w:h="18706" w:code="5"/>
-      <w:pgMar w:top="720" w:right="1440" w:bottom="720" w:left="1440" w:header="720" w:footer="907" w:gutter="0"/>
+      <w:pgMar w:top="284" w:right="1134" w:bottom="284" w:left="1134" w:header="720" w:footer="907" w:gutter="0"/>
       <w:cols w:space="720"/>
       <w:docGrid w:linePitch="360"/>
     </w:sectPr>
@@ -1981,81 +2056,6 @@
     </w:p>
   </w:footnote>
 </w:footnotes>
-</file>
-
-<file path=word/header1.xml><?xml version="1.0" encoding="utf-8"?>
-<w:hdr xmlns:wpc="http://schemas.microsoft.com/office/word/2010/wordprocessingCanvas" xmlns:cx="http://schemas.microsoft.com/office/drawing/2014/chartex" xmlns:cx1="http://schemas.microsoft.com/office/drawing/2015/9/8/chartex" xmlns:cx2="http://schemas.microsoft.com/office/drawing/2015/10/21/chartex" xmlns:cx3="http://schemas.microsoft.com/office/drawing/2016/5/9/chartex" xmlns:cx4="http://schemas.microsoft.com/office/drawing/2016/5/10/chartex" xmlns:cx5="http://schemas.microsoft.com/office/drawing/2016/5/11/chartex" xmlns:cx6="http://schemas.microsoft.com/office/drawing/2016/5/12/chartex" xmlns:cx7="http://schemas.microsoft.com/office/drawing/2016/5/13/chartex" xmlns:cx8="http://schemas.microsoft.com/office/drawing/2016/5/14/chartex" xmlns:mc="http://schemas.openxmlformats.org/markup-compatibility/2006" xmlns:aink="http://schemas.microsoft.com/office/drawing/2016/ink" xmlns:am3d="http://schemas.microsoft.com/office/drawing/2017/model3d" xmlns:o="urn:schemas-microsoft-com:office:office" xmlns:oel="http://schemas.microsoft.com/office/2019/extlst" xmlns:r="http://schemas.openxmlformats.org/officeDocument/2006/relationships" xmlns:m="http://schemas.openxmlformats.org/officeDocument/2006/math" xmlns:v="urn:schemas-microsoft-com:vml" xmlns:wp14="http://schemas.microsoft.com/office/word/2010/wordprocessingDrawing" xmlns:wp="http://schemas.openxmlformats.org/drawingml/2006/wordprocessingDrawing" xmlns:w10="urn:schemas-microsoft-com:office:word" xmlns:w="http://schemas.openxmlformats.org/wordprocessingml/2006/main" xmlns:w14="http://schemas.microsoft.com/office/word/2010/wordml" xmlns:w15="http://schemas.microsoft.com/office/word/2012/wordml" xmlns:w16cex="http://schemas.microsoft.com/office/word/2018/wordml/cex" xmlns:w16cid="http://schemas.microsoft.com/office/word/2016/wordml/cid" xmlns:w16="http://schemas.microsoft.com/office/word/2018/wordml" xmlns:w16du="http://schemas.microsoft.com/office/word/2023/wordml/word16du" xmlns:w16sdtdh="http://schemas.microsoft.com/office/word/2020/wordml/sdtdatahash" xmlns:w16sdtfl="http://schemas.microsoft.com/office/word/2024/wordml/sdtformatlock" xmlns:w16se="http://schemas.microsoft.com/office/word/2015/wordml/symex" xmlns:wpg="http://schemas.microsoft.com/office/word/2010/wordprocessingGroup" xmlns:wpi="http://schemas.microsoft.com/office/word/2010/wordprocessingInk" xmlns:wne="http://schemas.microsoft.com/office/word/2006/wordml" xmlns:wps="http://schemas.microsoft.com/office/word/2010/wordprocessingShape" mc:Ignorable="w14 w15 w16se w16cid w16 w16cex w16sdtdh w16sdtfl w16du wp14">
-  <w:p>
-    <w:pPr>
-      <w:pStyle w:val="Header"/>
-      <w:jc w:val="center"/>
-    </w:pPr>
-    <w:r>
-      <w:rPr>
-        <w:rFonts w:ascii="Bookman Old Style" w:hAnsi="Bookman Old Style" w:cs="Arial"/>
-        <w:noProof/>
-      </w:rPr>
-      <w:drawing>
-        <wp:inline distT="0" distB="0" distL="0" distR="0" wp14:anchorId="34A86B0C" wp14:editId="3C1F6894">
-          <wp:extent cx="846000" cy="900000"/>
-          <wp:effectExtent l="0" t="0" r="0" b="0"/>
-          <wp:docPr id="296857715" name="Picture 296857715"/>
-          <wp:cNvGraphicFramePr>
-            <a:graphicFrameLocks xmlns:a="http://schemas.openxmlformats.org/drawingml/2006/main"/>
-          </wp:cNvGraphicFramePr>
-          <a:graphic xmlns:a="http://schemas.openxmlformats.org/drawingml/2006/main">
-            <a:graphicData uri="http://schemas.openxmlformats.org/drawingml/2006/picture">
-              <pic:pic xmlns:pic="http://schemas.openxmlformats.org/drawingml/2006/picture">
-                <pic:nvPicPr>
-                  <pic:cNvPr id="1" name="kindpng_962264.png"/>
-                  <pic:cNvPicPr/>
-                </pic:nvPicPr>
-                <pic:blipFill>
-                  <a:blip r:embed="rId1" cstate="print">
-                    <a:extLst>
-                      <a:ext uri="{28A0092B-C50C-407E-A947-70E740481C1C}">
-                        <a14:useLocalDpi xmlns:a14="http://schemas.microsoft.com/office/drawing/2010/main" val="0"/>
-                      </a:ext>
-                    </a:extLst>
-                  </a:blip>
-                  <a:stretch>
-                    <a:fillRect/>
-                  </a:stretch>
-                </pic:blipFill>
-                <pic:spPr>
-                  <a:xfrm>
-                    <a:off x="0" y="0"/>
-                    <a:ext cx="846000" cy="900000"/>
-                  </a:xfrm>
-                  <a:prstGeom prst="rect">
-                    <a:avLst/>
-                  </a:prstGeom>
-                </pic:spPr>
-              </pic:pic>
-            </a:graphicData>
-          </a:graphic>
-        </wp:inline>
-      </w:drawing>
-    </w:r>
-  </w:p>
-  <w:p>
-    <w:pPr>
-      <w:pStyle w:val="Header"/>
-      <w:jc w:val="center"/>
-      <w:rPr>
-        <w:sz w:val="28"/>
-        <w:szCs w:val="28"/>
-      </w:rPr>
-    </w:pPr>
-    <w:r>
-      <w:rPr>
-        <w:sz w:val="28"/>
-        <w:szCs w:val="28"/>
-      </w:rPr>
-      <w:t>BUPATI BANGKA</w:t>
-    </w:r>
-  </w:p>
-</w:hdr>
 </file>
 
 <file path=word/numbering.xml><?xml version="1.0" encoding="utf-8"?>

</xml_diff>